<commit_message>
Add camera barcode scanning, scan UI updates, and user guide v5
</commit_message>
<xml_diff>
--- a/deploy/ThriftyChef_Web_App_User_Guide.docx
+++ b/deploy/ThriftyChef_Web_App_User_Guide.docx
@@ -22,7 +22,7 @@
         <w:rPr>
           <w:i/>
         </w:rPr>
-        <w:t>Product prototype — Flutter web + FastAPI (v4 — polished UI with food photography)</w:t>
+        <w:t>Product prototype — Flutter web + FastAPI (v5 — camera barcode scan added)</w:t>
       </w:r>
     </w:p>
     <w:p/>
@@ -458,7 +458,7 @@
           </w:tcPr>
           <w:p>
             <w:r>
-              <w:t>Barcode lookup — fridge or rescue-basket demo</w:t>
+              <w:t>Barcode lookup — camera scan or manual entry, fridge or rescue-basket demo</w:t>
             </w:r>
           </w:p>
         </w:tc>
@@ -730,7 +730,7 @@
           </w:tcPr>
           <w:p>
             <w:r>
-              <w:t>Manual entry (e.g. 6111246721261)</w:t>
+              <w:t>Camera scan or manual entry (e.g. 6111246721261)</w:t>
             </w:r>
           </w:p>
         </w:tc>
@@ -1048,7 +1048,7 @@
         <w:pStyle w:val="ListNumber"/>
       </w:pPr>
       <w:r>
-        <w:t>Enter barcode manually (web demo — no camera)</w:t>
+        <w:t>Use Open camera scanner or enter barcode manually</w:t>
       </w:r>
     </w:p>
     <w:p>
@@ -1056,7 +1056,23 @@
         <w:pStyle w:val="ListNumber"/>
       </w:pPr>
       <w:r>
-        <w:t>Look up product → nutrition panel and safety check</w:t>
+        <w:t>Allow camera permission and align barcode inside the frame</w:t>
+      </w:r>
+    </w:p>
+    <w:p>
+      <w:pPr>
+        <w:pStyle w:val="ListNumber"/>
+      </w:pPr>
+      <w:r>
+        <w:t>Detected barcode auto-fills and product lookup runs</w:t>
+      </w:r>
+    </w:p>
+    <w:p>
+      <w:pPr>
+        <w:pStyle w:val="ListNumber"/>
+      </w:pPr>
+      <w:r>
+        <w:t>Review nutrition panel and safety check</w:t>
       </w:r>
     </w:p>
     <w:p>
@@ -1078,6 +1094,30 @@
     <w:p>
       <w:r>
         <w:t>Demo barcode: 6111246721261</w:t>
+      </w:r>
+    </w:p>
+    <w:p>
+      <w:pPr>
+        <w:pStyle w:val="ListBullet"/>
+      </w:pPr>
+      <w:r>
+        <w:t>Web: camera scanning works when browser camera permission is allowed</w:t>
+      </w:r>
+    </w:p>
+    <w:p>
+      <w:pPr>
+        <w:pStyle w:val="ListBullet"/>
+      </w:pPr>
+      <w:r>
+        <w:t>Mobile: camera barcode scanning is included in the Scan tab</w:t>
+      </w:r>
+    </w:p>
+    <w:p>
+      <w:pPr>
+        <w:pStyle w:val="ListBullet"/>
+      </w:pPr>
+      <w:r>
+        <w:t>If camera access fails, type the barcode manually and tap Lookup product</w:t>
       </w:r>
     </w:p>
     <w:p>
@@ -1268,7 +1308,7 @@
         <w:pStyle w:val="ListNumber"/>
       </w:pPr>
       <w:r>
-        <w:t>Scan — barcode 6111246721261 in Rescue Basket mode → recipe ideas</w:t>
+        <w:t>Scan — use Open camera scanner or barcode 6111246721261 in Rescue Basket mode → recipe ideas</w:t>
       </w:r>
     </w:p>
     <w:p>
@@ -1398,7 +1438,7 @@
         <w:t xml:space="preserve">☐ </w:t>
       </w:r>
       <w:r>
-        <w:t>Scan tab: both modes, rescue recommendations</w:t>
+        <w:t>Scan tab: both modes, camera scan or manual entry, rescue recommendations</w:t>
       </w:r>
     </w:p>
     <w:p>
@@ -1575,6 +1615,50 @@
           </w:tcPr>
           <w:p>
             <w:r>
+              <w:t>Camera scanner not opening</w:t>
+            </w:r>
+          </w:p>
+        </w:tc>
+        <w:tc>
+          <w:tcPr>
+            <w:tcW w:type="dxa" w:w="4680"/>
+          </w:tcPr>
+          <w:p>
+            <w:r>
+              <w:t>Allow camera permission; on web use Chrome/Edge with 127.0.0.1 or HTTPS</w:t>
+            </w:r>
+          </w:p>
+        </w:tc>
+      </w:tr>
+      <w:tr>
+        <w:tc>
+          <w:tcPr>
+            <w:tcW w:type="dxa" w:w="4680"/>
+          </w:tcPr>
+          <w:p>
+            <w:r>
+              <w:t>Camera opens but does not detect</w:t>
+            </w:r>
+          </w:p>
+        </w:tc>
+        <w:tc>
+          <w:tcPr>
+            <w:tcW w:type="dxa" w:w="4680"/>
+          </w:tcPr>
+          <w:p>
+            <w:r>
+              <w:t>Improve lighting, hold barcode inside the frame, or type it manually</w:t>
+            </w:r>
+          </w:p>
+        </w:tc>
+      </w:tr>
+      <w:tr>
+        <w:tc>
+          <w:tcPr>
+            <w:tcW w:type="dxa" w:w="4680"/>
+          </w:tcPr>
+          <w:p>
+            <w:r>
               <w:t>No food photos</w:t>
             </w:r>
           </w:p>
@@ -1700,7 +1784,7 @@
         <w:pStyle w:val="ListBullet"/>
       </w:pPr>
       <w:r>
-        <w:t>Web barcode = manual entry (no camera)</w:t>
+        <w:t>Browser camera access depends on permission settings and secure-context support</w:t>
       </w:r>
     </w:p>
     <w:p>
@@ -1788,7 +1872,7 @@
         <w:pStyle w:val="ListNumber"/>
       </w:pPr>
       <w:r>
-        <w:t>Scan — rescue basket mode, nutrition panel</w:t>
+        <w:t>Scan — camera scanner open, or rescue basket mode with nutrition panel</w:t>
       </w:r>
     </w:p>
     <w:p>

</xml_diff>